<commit_message>
Refresh fixture documentation and wiring workbook
Update the Docs markdown set to match the current fixture workflow, regenerate the Word document versions, style the high-level wiring spreadsheet, and ignore Office temporary lock files.
</commit_message>
<xml_diff>
--- a/Docs/Word/README.docx
+++ b/Docs/Word/README.docx
@@ -5,35 +5,72 @@
     <w:p>
       <w:pPr>
         <w:pStyle w:val="Title"/>
+        <w:spacing w:before="0" w:after="160"/>
         <w:jc w:val="center"/>
       </w:pPr>
       <w:r>
-        <w:rPr>
-          <w:b w:val="0"/>
-          <w:i w:val="0"/>
-        </w:rPr>
-        <w:t>Documentation</w:t>
-      </w:r>
-    </w:p>
-    <w:p>
-      <w:r>
-        <w:rPr>
-          <w:b w:val="0"/>
-          <w:i w:val="0"/>
-        </w:rPr>
-        <w:t>This folder contains documentation and reference materials for the EOL TestFixture Project.</w:t>
+        <w:t>EOL Test Fixture Documentation</w:t>
       </w:r>
     </w:p>
     <w:p>
       <w:pPr>
-        <w:pStyle w:val="Heading2"/>
+        <w:pStyle w:val="Subtitle"/>
+        <w:jc w:val="center"/>
+      </w:pPr>
+      <w:r>
+        <w:t>Rite-Hite EOL Test Fixture Documentation</w:t>
+      </w:r>
+    </w:p>
+    <w:p>
+      <w:pPr>
+        <w:pStyle w:val="BodySmall"/>
+        <w:spacing w:before="0" w:after="360"/>
+        <w:jc w:val="center"/>
+      </w:pPr>
+      <w:r>
+        <w:t>Generated from current project markdown on April 16, 2026</w:t>
+      </w:r>
+    </w:p>
+    <w:p>
+      <w:pPr>
+        <w:jc w:val="center"/>
+        <w:pBdr>
+          <w:bottom w:val="single" w:sz="12" w:space="1" w:color="C8102E"/>
+        </w:pBdr>
       </w:pPr>
       <w:r>
         <w:rPr>
-          <w:b w:val="0"/>
-          <w:i w:val="0"/>
+          <w:sz w:val="2"/>
         </w:rPr>
-        <w:t>Contents</w:t>
+        <w:t xml:space="preserve"> </w:t>
+      </w:r>
+    </w:p>
+    <w:p>
+      <w:pPr>
+        <w:sectPr>
+          <w:headerReference w:type="default" r:id="rId9"/>
+          <w:footerReference w:type="default" r:id="rId10"/>
+          <w:pgSz w:w="12240" w:h="15840"/>
+          <w:pgMar w:top="1152" w:right="1224" w:bottom="1008" w:left="1224" w:header="504" w:footer="504" w:gutter="0"/>
+          <w:cols w:space="720"/>
+          <w:docGrid w:linePitch="360"/>
+        </w:sectPr>
+      </w:pPr>
+    </w:p>
+    <w:p>
+      <w:pPr>
+        <w:spacing w:before="0" w:after="120" w:line="240" w:lineRule="auto"/>
+      </w:pPr>
+      <w:r>
+        <w:t>This folder contains the working documentation set for the Rite-Hite end-of-line test fixture.</w:t>
+      </w:r>
+    </w:p>
+    <w:p>
+      <w:pPr>
+        <w:spacing w:before="0" w:after="120" w:line="240" w:lineRule="auto"/>
+      </w:pPr>
+      <w:r>
+        <w:t>The system has three major parts:</w:t>
       </w:r>
     </w:p>
     <w:p>
@@ -41,18 +78,7 @@
         <w:pStyle w:val="ListBullet"/>
       </w:pPr>
       <w:r>
-        <w:rPr>
-          <w:b/>
-          <w:i w:val="0"/>
-        </w:rPr>
-        <w:t>Architecture</w:t>
-      </w:r>
-      <w:r>
-        <w:rPr>
-          <w:b w:val="0"/>
-          <w:i w:val="0"/>
-        </w:rPr>
-        <w:t>: System architecture and design documents</w:t>
+        <w:t>An STM32U575-based fixture that runs the test flow and TouchGFX touchscreen UI</w:t>
       </w:r>
     </w:p>
     <w:p>
@@ -60,18 +86,7 @@
         <w:pStyle w:val="ListBullet"/>
       </w:pPr>
       <w:r>
-        <w:rPr>
-          <w:b/>
-          <w:i w:val="0"/>
-        </w:rPr>
-        <w:t>API</w:t>
-      </w:r>
-      <w:r>
-        <w:rPr>
-          <w:b w:val="0"/>
-          <w:i w:val="0"/>
-        </w:rPr>
-        <w:t>: API reference and integration guides</w:t>
+        <w:t>An ESP32-S3 test target firmware that responds to the fixture protocol</w:t>
       </w:r>
     </w:p>
     <w:p>
@@ -79,18 +94,15 @@
         <w:pStyle w:val="ListBullet"/>
       </w:pPr>
       <w:r>
-        <w:rPr>
-          <w:b/>
-          <w:i w:val="0"/>
-        </w:rPr>
-        <w:t>Configuration</w:t>
+        <w:t>A Windows PySide6 desktop app that uploads test firmware, exports CSV results, and runs the One Click workflow</w:t>
       </w:r>
+    </w:p>
+    <w:p>
+      <w:pPr>
+        <w:spacing w:before="0" w:after="120" w:line="240" w:lineRule="auto"/>
+      </w:pPr>
       <w:r>
-        <w:rPr>
-          <w:b w:val="0"/>
-          <w:i w:val="0"/>
-        </w:rPr>
-        <w:t>: Configuration guides and parameters</w:t>
+        <w:t>This documentation set is written for two audiences:</w:t>
       </w:r>
     </w:p>
     <w:p>
@@ -98,18 +110,7 @@
         <w:pStyle w:val="ListBullet"/>
       </w:pPr>
       <w:r>
-        <w:rPr>
-          <w:b/>
-          <w:i w:val="0"/>
-        </w:rPr>
-        <w:t>Hardware</w:t>
-      </w:r>
-      <w:r>
-        <w:rPr>
-          <w:b w:val="0"/>
-          <w:i w:val="0"/>
-        </w:rPr>
-        <w:t>: Hardware specifications and interface documentation</w:t>
+        <w:t>Technicians and operators who need to run the station correctly and recover from failures</w:t>
       </w:r>
     </w:p>
     <w:p>
@@ -117,18 +118,16 @@
         <w:pStyle w:val="ListBullet"/>
       </w:pPr>
       <w:r>
-        <w:rPr>
-          <w:b/>
-          <w:i w:val="0"/>
-        </w:rPr>
-        <w:t>Software</w:t>
+        <w:t>Engineers who need to maintain the firmware, TouchGFX screens, serial protocol, and desktop app</w:t>
       </w:r>
+    </w:p>
+    <w:p>
+      <w:pPr>
+        <w:pStyle w:val="Heading1"/>
+        <w:spacing w:before="240" w:after="120"/>
+      </w:pPr>
       <w:r>
-        <w:rPr>
-          <w:b w:val="0"/>
-          <w:i w:val="0"/>
-        </w:rPr>
-        <w:t>: Software design and development guides</w:t>
+        <w:t>Start Here</w:t>
       </w:r>
     </w:p>
     <w:p>
@@ -136,39 +135,196 @@
         <w:pStyle w:val="ListBullet"/>
       </w:pPr>
       <w:r>
-        <w:rPr>
-          <w:b/>
-          <w:i w:val="0"/>
-        </w:rPr>
-        <w:t>Procedures</w:t>
+        <w:t xml:space="preserve">Operators: begin with </w:t>
       </w:r>
+      <w:hyperlink r:id="rId13">
+        <w:r>
+          <w:rPr>
+            <w:color w:val="C8102E"/>
+            <w:u w:val="single"/>
+          </w:rPr>
+          <w:t>EOL Test Fixture User Manual</w:t>
+        </w:r>
+      </w:hyperlink>
+    </w:p>
+    <w:p>
+      <w:pPr>
+        <w:pStyle w:val="ListBullet"/>
+      </w:pPr>
       <w:r>
-        <w:rPr>
-          <w:b w:val="0"/>
-          <w:i w:val="0"/>
-        </w:rPr>
-        <w:t>: Operating and testing procedures</w:t>
+        <w:t xml:space="preserve">Engineers: begin with </w:t>
+      </w:r>
+      <w:hyperlink r:id="rId14">
+        <w:r>
+          <w:rPr>
+            <w:color w:val="C8102E"/>
+            <w:u w:val="single"/>
+          </w:rPr>
+          <w:t>EOL Test Fixture Project Knowledge Base</w:t>
+        </w:r>
+      </w:hyperlink>
+    </w:p>
+    <w:p>
+      <w:pPr>
+        <w:pStyle w:val="Heading1"/>
+        <w:spacing w:before="240" w:after="120"/>
+      </w:pPr>
+      <w:r>
+        <w:t>Operator Documents</w:t>
       </w:r>
     </w:p>
     <w:p>
       <w:pPr>
-        <w:pStyle w:val="Heading2"/>
+        <w:pStyle w:val="ListBullet"/>
       </w:pPr>
+      <w:hyperlink r:id="rId13">
+        <w:r>
+          <w:rPr>
+            <w:color w:val="C8102E"/>
+            <w:u w:val="single"/>
+          </w:rPr>
+          <w:t>EOL Test Fixture User Manual</w:t>
+        </w:r>
+      </w:hyperlink>
       <w:r>
-        <w:rPr>
-          <w:b w:val="0"/>
-          <w:i w:val="0"/>
-        </w:rPr>
-        <w:t>Operator Documentation</w:t>
+        <w:t>: Primary station operating guide</w:t>
       </w:r>
     </w:p>
     <w:p>
+      <w:pPr>
+        <w:pStyle w:val="ListBullet"/>
+      </w:pPr>
+      <w:hyperlink r:id="rId15">
+        <w:r>
+          <w:rPr>
+            <w:color w:val="C8102E"/>
+            <w:u w:val="single"/>
+          </w:rPr>
+          <w:t>EOL Test Fixture Preflight Checklist</w:t>
+        </w:r>
+      </w:hyperlink>
       <w:r>
-        <w:rPr>
-          <w:b w:val="0"/>
-          <w:i w:val="0"/>
-        </w:rPr>
-        <w:t>The main operator-facing documents in this folder are:</w:t>
+        <w:t>: Station readiness and shift-start checklist</w:t>
+      </w:r>
+    </w:p>
+    <w:p>
+      <w:pPr>
+        <w:pStyle w:val="ListBullet"/>
+      </w:pPr>
+      <w:hyperlink r:id="rId16">
+        <w:r>
+          <w:rPr>
+            <w:color w:val="C8102E"/>
+            <w:u w:val="single"/>
+          </w:rPr>
+          <w:t>EOL Test Fixture Screen Guide</w:t>
+        </w:r>
+      </w:hyperlink>
+      <w:r>
+        <w:t>: Touchscreen and desktop-app screen reference</w:t>
+      </w:r>
+    </w:p>
+    <w:p>
+      <w:pPr>
+        <w:pStyle w:val="ListBullet"/>
+      </w:pPr>
+      <w:hyperlink r:id="rId17">
+        <w:r>
+          <w:rPr>
+            <w:color w:val="C8102E"/>
+            <w:u w:val="single"/>
+          </w:rPr>
+          <w:t>End-of-Line Test Procedure</w:t>
+        </w:r>
+      </w:hyperlink>
+      <w:r>
+        <w:t>: Formal production and One Click procedures</w:t>
+      </w:r>
+    </w:p>
+    <w:p>
+      <w:pPr>
+        <w:pStyle w:val="ListBullet"/>
+      </w:pPr>
+      <w:hyperlink r:id="rId18">
+        <w:r>
+          <w:rPr>
+            <w:color w:val="C8102E"/>
+            <w:u w:val="single"/>
+          </w:rPr>
+          <w:t>EOL Test Fixture Troubleshooting Guide</w:t>
+        </w:r>
+      </w:hyperlink>
+      <w:r>
+        <w:t>: Operator recovery steps and station issues</w:t>
+      </w:r>
+    </w:p>
+    <w:p>
+      <w:pPr>
+        <w:pStyle w:val="ListBullet"/>
+      </w:pPr>
+      <w:hyperlink r:id="rId19">
+        <w:r>
+          <w:rPr>
+            <w:color w:val="C8102E"/>
+            <w:u w:val="single"/>
+          </w:rPr>
+          <w:t>End-of-Line Error Code Reference</w:t>
+        </w:r>
+      </w:hyperlink>
+      <w:r>
+        <w:t>: Fault codes, protocol states, and export errors</w:t>
+      </w:r>
+    </w:p>
+    <w:p>
+      <w:pPr>
+        <w:pStyle w:val="Heading1"/>
+        <w:spacing w:before="240" w:after="120"/>
+      </w:pPr>
+      <w:r>
+        <w:t>Engineering Documents</w:t>
+      </w:r>
+    </w:p>
+    <w:p>
+      <w:pPr>
+        <w:pStyle w:val="ListBullet"/>
+      </w:pPr>
+      <w:hyperlink r:id="rId14">
+        <w:r>
+          <w:rPr>
+            <w:color w:val="C8102E"/>
+            <w:u w:val="single"/>
+          </w:rPr>
+          <w:t>EOL Test Fixture Project Knowledge Base</w:t>
+        </w:r>
+      </w:hyperlink>
+      <w:r>
+        <w:t>: Architecture, protocol, hardware map, and stage behavior</w:t>
+      </w:r>
+    </w:p>
+    <w:p>
+      <w:pPr>
+        <w:pStyle w:val="ListBullet"/>
+      </w:pPr>
+      <w:hyperlink r:id="rId20">
+        <w:r>
+          <w:rPr>
+            <w:color w:val="C8102E"/>
+            <w:u w:val="single"/>
+          </w:rPr>
+          <w:t>Project Firmware And Maintenance Reference</w:t>
+        </w:r>
+      </w:hyperlink>
+      <w:r>
+        <w:t>: Project-specific firmware and maintenance reference</w:t>
+      </w:r>
+    </w:p>
+    <w:p>
+      <w:pPr>
+        <w:pStyle w:val="Heading1"/>
+        <w:spacing w:before="240" w:after="120"/>
+      </w:pPr>
+      <w:r>
+        <w:t>Current System Behavior Summary</w:t>
       </w:r>
     </w:p>
     <w:p>
@@ -176,13 +332,29 @@
         <w:pStyle w:val="ListBullet"/>
       </w:pPr>
       <w:r>
+        <w:t xml:space="preserve">The fixture touchscreen supports </w:t>
+      </w:r>
+      <w:r>
         <w:rPr>
-          <w:b w:val="0"/>
-          <w:i w:val="0"/>
-          <w:color w:val="0563C1"/>
-          <w:u w:val="single"/>
+          <w:rFonts w:ascii="Consolas" w:hAnsi="Consolas"/>
+          <w:sz w:val="19"/>
+          <w:shd w:fill="F3F4F6"/>
         </w:rPr>
-        <w:t>User Manual</w:t>
+        <w:t>Begin AUTO</w:t>
+      </w:r>
+      <w:r>
+        <w:t xml:space="preserve"> for the production flow and </w:t>
+      </w:r>
+      <w:r>
+        <w:rPr>
+          <w:rFonts w:ascii="Consolas" w:hAnsi="Consolas"/>
+          <w:sz w:val="19"/>
+          <w:shd w:fill="F3F4F6"/>
+        </w:rPr>
+        <w:t>Begin MANUAL</w:t>
+      </w:r>
+      <w:r>
+        <w:t xml:space="preserve"> for the service GPIO screen.</w:t>
       </w:r>
     </w:p>
     <w:p>
@@ -190,13 +362,7 @@
         <w:pStyle w:val="ListBullet"/>
       </w:pPr>
       <w:r>
-        <w:rPr>
-          <w:b w:val="0"/>
-          <w:i w:val="0"/>
-          <w:color w:val="0563C1"/>
-          <w:u w:val="single"/>
-        </w:rPr>
-        <w:t>Preflight Checklist</w:t>
+        <w:t>The automatic fixture flow runs in this order: Communication, MCU Reset, Fault Check, Digital Inputs, Analog Inputs, Outputs, Buttons, LED Visual Check.</w:t>
       </w:r>
     </w:p>
     <w:p>
@@ -204,13 +370,7 @@
         <w:pStyle w:val="ListBullet"/>
       </w:pPr>
       <w:r>
-        <w:rPr>
-          <w:b w:val="0"/>
-          <w:i w:val="0"/>
-          <w:color w:val="0563C1"/>
-          <w:u w:val="single"/>
-        </w:rPr>
-        <w:t>Screen Guide</w:t>
+        <w:t>The fixture automatically drives the button sequence during the Buttons stage. The technician does not manually press the hardware buttons during the normal automatic flow.</w:t>
       </w:r>
     </w:p>
     <w:p>
@@ -218,13 +378,29 @@
         <w:pStyle w:val="ListBullet"/>
       </w:pPr>
       <w:r>
+        <w:t xml:space="preserve">The final LED decision is still manual. The technician must press </w:t>
+      </w:r>
+      <w:r>
         <w:rPr>
-          <w:b w:val="0"/>
-          <w:i w:val="0"/>
-          <w:color w:val="0563C1"/>
-          <w:u w:val="single"/>
+          <w:rFonts w:ascii="Consolas" w:hAnsi="Consolas"/>
+          <w:sz w:val="19"/>
+          <w:shd w:fill="F3F4F6"/>
         </w:rPr>
-        <w:t>Troubleshooting Guide</w:t>
+        <w:t>LED's GOOD</w:t>
+      </w:r>
+      <w:r>
+        <w:t xml:space="preserve"> or </w:t>
+      </w:r>
+      <w:r>
+        <w:rPr>
+          <w:rFonts w:ascii="Consolas" w:hAnsi="Consolas"/>
+          <w:sz w:val="19"/>
+          <w:shd w:fill="F3F4F6"/>
+        </w:rPr>
+        <w:t>LED's BAD</w:t>
+      </w:r>
+      <w:r>
+        <w:t xml:space="preserve"> on the touchscreen.</w:t>
       </w:r>
     </w:p>
     <w:p>
@@ -232,13 +408,18 @@
         <w:pStyle w:val="ListBullet"/>
       </w:pPr>
       <w:r>
+        <w:t xml:space="preserve">Failed runs remain exportable after the fixture reaches </w:t>
+      </w:r>
+      <w:r>
         <w:rPr>
-          <w:b w:val="0"/>
-          <w:i w:val="0"/>
-          <w:color w:val="0563C1"/>
-          <w:u w:val="single"/>
+          <w:rFonts w:ascii="Consolas" w:hAnsi="Consolas"/>
+          <w:sz w:val="19"/>
+          <w:shd w:fill="F3F4F6"/>
         </w:rPr>
-        <w:t>Test Procedure</w:t>
+        <w:t>Fault_Screen</w:t>
+      </w:r>
+      <w:r>
+        <w:t>.</w:t>
       </w:r>
     </w:p>
     <w:p>
@@ -246,44 +427,154 @@
         <w:pStyle w:val="ListBullet"/>
       </w:pPr>
       <w:r>
+        <w:t xml:space="preserve">The desktop app has three working pages: </w:t>
+      </w:r>
+      <w:r>
         <w:rPr>
-          <w:b w:val="0"/>
-          <w:i w:val="0"/>
-          <w:color w:val="0563C1"/>
-          <w:u w:val="single"/>
+          <w:rFonts w:ascii="Consolas" w:hAnsi="Consolas"/>
+          <w:sz w:val="19"/>
+          <w:shd w:fill="F3F4F6"/>
         </w:rPr>
-        <w:t>Error Code Reference</w:t>
+        <w:t>File Explorer</w:t>
+      </w:r>
+      <w:r>
+        <w:t xml:space="preserve">, </w:t>
+      </w:r>
+      <w:r>
+        <w:rPr>
+          <w:rFonts w:ascii="Consolas" w:hAnsi="Consolas"/>
+          <w:sz w:val="19"/>
+          <w:shd w:fill="F3F4F6"/>
+        </w:rPr>
+        <w:t>Device Tools</w:t>
+      </w:r>
+      <w:r>
+        <w:t xml:space="preserve">, and </w:t>
+      </w:r>
+      <w:r>
+        <w:rPr>
+          <w:rFonts w:ascii="Consolas" w:hAnsi="Consolas"/>
+          <w:sz w:val="19"/>
+          <w:shd w:fill="F3F4F6"/>
+        </w:rPr>
+        <w:t>One Click Test</w:t>
+      </w:r>
+      <w:r>
+        <w:t>.</w:t>
       </w:r>
     </w:p>
     <w:p>
       <w:pPr>
-        <w:pStyle w:val="Heading2"/>
+        <w:pStyle w:val="ListBullet"/>
       </w:pPr>
       <w:r>
-        <w:rPr>
-          <w:b w:val="0"/>
-          <w:i w:val="0"/>
-        </w:rPr>
-        <w:t>AI Agent Information Source</w:t>
+        <w:t>One Click uploads the Rite-Hite Connect test firmware, starts the fixture automatic test, tracks live progress, waits for the LED decision, and exports the final CSV automatically.</w:t>
       </w:r>
     </w:p>
     <w:p>
+      <w:pPr>
+        <w:pStyle w:val="ListBullet"/>
+      </w:pPr>
       <w:r>
-        <w:rPr>
-          <w:b w:val="0"/>
-          <w:i w:val="0"/>
-        </w:rPr>
-        <w:t>This folder serves as a centralized knowledge base for the AI agent to pull project information, specifications, and documentation.</w:t>
+        <w:t>The One Click progress rail follows the real fixture stage in this order: Upload Firmware, Comms, Digital Inputs, Analog Inputs, Digital Outputs, Relay Outputs, Buttons, LEDs, Extract Data.</w:t>
+      </w:r>
+    </w:p>
+    <w:p>
+      <w:pPr>
+        <w:pStyle w:val="ListBullet"/>
+      </w:pPr>
+      <w:r>
+        <w:t>Digital Output 1 and Digital Output 2 are still temporary auto-pass rows in the current firmware revision.</w:t>
+      </w:r>
+    </w:p>
+    <w:p>
+      <w:pPr>
+        <w:pStyle w:val="ListBullet"/>
+      </w:pPr>
+      <w:r>
+        <w:t>The desktop app shows a production firmware upload card, but the production upload action is not available yet.</w:t>
+      </w:r>
+    </w:p>
+    <w:p>
+      <w:pPr>
+        <w:pStyle w:val="Heading1"/>
+        <w:spacing w:before="240" w:after="120"/>
+      </w:pPr>
+      <w:r>
+        <w:t>Documentation Update Rule</w:t>
+      </w:r>
+    </w:p>
+    <w:p>
+      <w:pPr>
+        <w:spacing w:before="0" w:after="120" w:line="240" w:lineRule="auto"/>
+      </w:pPr>
+      <w:r>
+        <w:t>If firmware behavior, protocol tokens, screen flow, desktop app workflow, or station wiring changes, update these markdown files in the same change set. The documents in this folder are intended to match the current software exactly, not a planned future state.</w:t>
       </w:r>
     </w:p>
     <w:sectPr>
+      <w:headerReference w:type="default" r:id="rId11"/>
+      <w:footerReference w:type="default" r:id="rId12"/>
       <w:pgSz w:w="12240" w:h="15840"/>
-      <w:pgMar w:top="1080" w:right="1080" w:bottom="1080" w:left="1080" w:header="720" w:footer="720" w:gutter="0"/>
+      <w:pgMar w:top="1152" w:right="1224" w:bottom="1008" w:left="1224" w:header="504" w:footer="504" w:gutter="0"/>
       <w:cols w:space="720"/>
       <w:docGrid w:linePitch="360"/>
     </w:sectPr>
   </w:body>
 </w:document>
+</file>
+
+<file path=word/footer1.xml><?xml version="1.0" encoding="utf-8"?>
+<w:ftr xmlns:m="http://schemas.openxmlformats.org/officeDocument/2006/math" xmlns:mc="http://schemas.openxmlformats.org/markup-compatibility/2006" xmlns:mo="http://schemas.microsoft.com/office/mac/office/2008/main" xmlns:mv="urn:schemas-microsoft-com:mac:vml" xmlns:o="urn:schemas-microsoft-com:office:office" xmlns:r="http://schemas.openxmlformats.org/officeDocument/2006/relationships" xmlns:v="urn:schemas-microsoft-com:vml" xmlns:w10="urn:schemas-microsoft-com:office:word" xmlns:w14="http://schemas.microsoft.com/office/word/2010/wordml" xmlns:w="http://schemas.openxmlformats.org/wordprocessingml/2006/main" xmlns:wne="http://schemas.microsoft.com/office/word/2006/wordml" xmlns:wp14="http://schemas.microsoft.com/office/word/2010/wordprocessingDrawing" xmlns:wp="http://schemas.openxmlformats.org/drawingml/2006/wordprocessingDrawing" xmlns:wpc="http://schemas.microsoft.com/office/word/2010/wordprocessingCanvas" xmlns:wpg="http://schemas.microsoft.com/office/word/2010/wordprocessingGroup" xmlns:wpi="http://schemas.microsoft.com/office/word/2010/wordprocessingInk" xmlns:wps="http://schemas.microsoft.com/office/word/2010/wordprocessingShape" mc:Ignorable="w14 wp14">
+  <w:p>
+    <w:pPr>
+      <w:jc w:val="center"/>
+    </w:pPr>
+    <w:r>
+      <w:rPr>
+        <w:rFonts w:ascii="Aptos" w:hAnsi="Aptos"/>
+        <w:color w:val="58606C"/>
+        <w:sz w:val="17"/>
+      </w:rPr>
+      <w:t>EOL Test Fixture Documentation</w:t>
+    </w:r>
+  </w:p>
+</w:ftr>
+</file>
+
+<file path=word/footer2.xml><?xml version="1.0" encoding="utf-8"?>
+<w:ftr xmlns:m="http://schemas.openxmlformats.org/officeDocument/2006/math" xmlns:mc="http://schemas.openxmlformats.org/markup-compatibility/2006" xmlns:mo="http://schemas.microsoft.com/office/mac/office/2008/main" xmlns:mv="urn:schemas-microsoft-com:mac:vml" xmlns:o="urn:schemas-microsoft-com:office:office" xmlns:r="http://schemas.openxmlformats.org/officeDocument/2006/relationships" xmlns:v="urn:schemas-microsoft-com:vml" xmlns:w10="urn:schemas-microsoft-com:office:word" xmlns:w14="http://schemas.microsoft.com/office/word/2010/wordml" xmlns:w="http://schemas.openxmlformats.org/wordprocessingml/2006/main" xmlns:wne="http://schemas.microsoft.com/office/word/2006/wordml" xmlns:wp14="http://schemas.microsoft.com/office/word/2010/wordprocessingDrawing" xmlns:wp="http://schemas.openxmlformats.org/drawingml/2006/wordprocessingDrawing" xmlns:wpc="http://schemas.microsoft.com/office/word/2010/wordprocessingCanvas" xmlns:wpg="http://schemas.microsoft.com/office/word/2010/wordprocessingGroup" xmlns:wpi="http://schemas.microsoft.com/office/word/2010/wordprocessingInk" xmlns:wps="http://schemas.microsoft.com/office/word/2010/wordprocessingShape" mc:Ignorable="w14 wp14">
+  <w:p>
+    <w:pPr>
+      <w:pStyle w:val="Footer"/>
+    </w:pPr>
+  </w:p>
+</w:ftr>
+</file>
+
+<file path=word/header1.xml><?xml version="1.0" encoding="utf-8"?>
+<w:hdr xmlns:m="http://schemas.openxmlformats.org/officeDocument/2006/math" xmlns:mc="http://schemas.openxmlformats.org/markup-compatibility/2006" xmlns:mo="http://schemas.microsoft.com/office/mac/office/2008/main" xmlns:mv="urn:schemas-microsoft-com:mac:vml" xmlns:o="urn:schemas-microsoft-com:office:office" xmlns:r="http://schemas.openxmlformats.org/officeDocument/2006/relationships" xmlns:v="urn:schemas-microsoft-com:vml" xmlns:w10="urn:schemas-microsoft-com:office:word" xmlns:w14="http://schemas.microsoft.com/office/word/2010/wordml" xmlns:w="http://schemas.openxmlformats.org/wordprocessingml/2006/main" xmlns:wne="http://schemas.microsoft.com/office/word/2006/wordml" xmlns:wp14="http://schemas.microsoft.com/office/word/2010/wordprocessingDrawing" xmlns:wp="http://schemas.openxmlformats.org/drawingml/2006/wordprocessingDrawing" xmlns:wpc="http://schemas.microsoft.com/office/word/2010/wordprocessingCanvas" xmlns:wpg="http://schemas.microsoft.com/office/word/2010/wordprocessingGroup" xmlns:wpi="http://schemas.microsoft.com/office/word/2010/wordprocessingInk" xmlns:wps="http://schemas.microsoft.com/office/word/2010/wordprocessingShape" mc:Ignorable="w14 wp14">
+  <w:p>
+    <w:r>
+      <w:rPr>
+        <w:rFonts w:ascii="Aptos" w:hAnsi="Aptos"/>
+        <w:color w:val="58606C"/>
+        <w:sz w:val="17"/>
+      </w:rPr>
+      <w:t>Rite-Hite EOL Test Fixture | EOL Test Fixture Documentation</w:t>
+    </w:r>
+  </w:p>
+</w:hdr>
+</file>
+
+<file path=word/header2.xml><?xml version="1.0" encoding="utf-8"?>
+<w:hdr xmlns:m="http://schemas.openxmlformats.org/officeDocument/2006/math" xmlns:mc="http://schemas.openxmlformats.org/markup-compatibility/2006" xmlns:mo="http://schemas.microsoft.com/office/mac/office/2008/main" xmlns:mv="urn:schemas-microsoft-com:mac:vml" xmlns:o="urn:schemas-microsoft-com:office:office" xmlns:r="http://schemas.openxmlformats.org/officeDocument/2006/relationships" xmlns:v="urn:schemas-microsoft-com:vml" xmlns:w10="urn:schemas-microsoft-com:office:word" xmlns:w14="http://schemas.microsoft.com/office/word/2010/wordml" xmlns:w="http://schemas.openxmlformats.org/wordprocessingml/2006/main" xmlns:wne="http://schemas.microsoft.com/office/word/2006/wordml" xmlns:wp14="http://schemas.microsoft.com/office/word/2010/wordprocessingDrawing" xmlns:wp="http://schemas.openxmlformats.org/drawingml/2006/wordprocessingDrawing" xmlns:wpc="http://schemas.microsoft.com/office/word/2010/wordprocessingCanvas" xmlns:wpg="http://schemas.microsoft.com/office/word/2010/wordprocessingGroup" xmlns:wpi="http://schemas.microsoft.com/office/word/2010/wordprocessingInk" xmlns:wps="http://schemas.microsoft.com/office/word/2010/wordprocessingShape" mc:Ignorable="w14 wp14">
+  <w:p>
+    <w:pPr>
+      <w:pStyle w:val="Header"/>
+    </w:pPr>
+  </w:p>
+</w:hdr>
 </file>
 
 <file path=word/numbering.xml><?xml version="1.0" encoding="utf-8"?>
@@ -650,7 +941,8 @@
     <w:qFormat/>
     <w:rsid w:val="00FC693F"/>
     <w:rPr>
-      <w:rFonts w:ascii="Calibri" w:hAnsi="Calibri"/>
+      <w:rFonts w:ascii="Aptos" w:hAnsi="Aptos"/>
+      <w:color w:val="2B3E5D"/>
       <w:sz w:val="22"/>
     </w:rPr>
   </w:style>
@@ -713,11 +1005,11 @@
       <w:outlineLvl w:val="0"/>
     </w:pPr>
     <w:rPr>
-      <w:rFonts w:asciiTheme="majorHAnsi" w:eastAsiaTheme="majorEastAsia" w:hAnsiTheme="majorHAnsi" w:cstheme="majorBidi" w:ascii="Calibri" w:hAnsi="Calibri"/>
+      <w:rFonts w:asciiTheme="majorHAnsi" w:eastAsiaTheme="majorEastAsia" w:hAnsiTheme="majorHAnsi" w:cstheme="majorBidi" w:ascii="Aptos" w:hAnsi="Aptos"/>
       <w:b/>
       <w:bCs/>
-      <w:color w:val="1F2937"/>
-      <w:sz w:val="36"/>
+      <w:color w:val="0F264A"/>
+      <w:sz w:val="32"/>
       <w:szCs w:val="28"/>
     </w:rPr>
   </w:style>
@@ -737,11 +1029,11 @@
       <w:outlineLvl w:val="1"/>
     </w:pPr>
     <w:rPr>
-      <w:rFonts w:asciiTheme="majorHAnsi" w:eastAsiaTheme="majorEastAsia" w:hAnsiTheme="majorHAnsi" w:cstheme="majorBidi" w:ascii="Calibri" w:hAnsi="Calibri"/>
+      <w:rFonts w:asciiTheme="majorHAnsi" w:eastAsiaTheme="majorEastAsia" w:hAnsiTheme="majorHAnsi" w:cstheme="majorBidi" w:ascii="Aptos" w:hAnsi="Aptos"/>
       <w:b/>
       <w:bCs/>
-      <w:color w:val="374151"/>
-      <w:sz w:val="30"/>
+      <w:color w:val="C8102E"/>
+      <w:sz w:val="26"/>
       <w:szCs w:val="26"/>
     </w:rPr>
   </w:style>
@@ -761,11 +1053,11 @@
       <w:outlineLvl w:val="2"/>
     </w:pPr>
     <w:rPr>
-      <w:rFonts w:asciiTheme="majorHAnsi" w:eastAsiaTheme="majorEastAsia" w:hAnsiTheme="majorHAnsi" w:cstheme="majorBidi" w:ascii="Calibri" w:hAnsi="Calibri"/>
+      <w:rFonts w:asciiTheme="majorHAnsi" w:eastAsiaTheme="majorEastAsia" w:hAnsiTheme="majorHAnsi" w:cstheme="majorBidi" w:ascii="Aptos" w:hAnsi="Aptos"/>
       <w:b/>
       <w:bCs/>
-      <w:color w:val="374151"/>
-      <w:sz w:val="26"/>
+      <w:color w:val="0F264A"/>
+      <w:sz w:val="22"/>
     </w:rPr>
   </w:style>
   <w:style w:type="paragraph" w:styleId="Heading4">
@@ -1003,8 +1295,9 @@
       <w:contextualSpacing/>
     </w:pPr>
     <w:rPr>
-      <w:rFonts w:asciiTheme="majorHAnsi" w:eastAsiaTheme="majorEastAsia" w:hAnsiTheme="majorHAnsi" w:cstheme="majorBidi" w:ascii="Calibri" w:hAnsi="Calibri"/>
-      <w:color w:val="1F2937"/>
+      <w:rFonts w:asciiTheme="majorHAnsi" w:eastAsiaTheme="majorEastAsia" w:hAnsiTheme="majorHAnsi" w:cstheme="majorBidi" w:ascii="Aptos" w:hAnsi="Aptos"/>
+      <w:b/>
+      <w:color w:val="0F264A"/>
       <w:spacing w:val="5"/>
       <w:kern w:val="28"/>
       <w:sz w:val="48"/>
@@ -1040,12 +1333,13 @@
       </w:numPr>
     </w:pPr>
     <w:rPr>
-      <w:rFonts w:asciiTheme="majorHAnsi" w:eastAsiaTheme="majorEastAsia" w:hAnsiTheme="majorHAnsi" w:cstheme="majorBidi"/>
+      <w:rFonts w:asciiTheme="majorHAnsi" w:eastAsiaTheme="majorEastAsia" w:hAnsiTheme="majorHAnsi" w:cstheme="majorBidi" w:ascii="Aptos" w:hAnsi="Aptos"/>
+      <w:b/>
       <w:i/>
       <w:iCs/>
-      <w:color w:val="4F81BD" w:themeColor="accent1"/>
+      <w:color w:val="58606C"/>
       <w:spacing w:val="15"/>
-      <w:sz w:val="24"/>
+      <w:sz w:val="22"/>
       <w:szCs w:val="24"/>
     </w:rPr>
   </w:style>
@@ -12336,6 +12630,15 @@
         <w:shd w:val="clear" w:color="auto" w:fill="FBCAA2" w:themeFill="accent6" w:themeFillTint="7F"/>
       </w:tcPr>
     </w:tblStylePr>
+  </w:style>
+  <w:style w:type="paragraph" w:customStyle="1" w:styleId="BodySmall">
+    <w:name w:val="Body Small"/>
+    <w:basedOn w:val="Normal"/>
+    <w:rPr>
+      <w:rFonts w:ascii="Aptos" w:hAnsi="Aptos"/>
+      <w:color w:val="58606C"/>
+      <w:sz w:val="19"/>
+    </w:rPr>
   </w:style>
 </w:styles>
 </file>

</xml_diff>